<commit_message>
Refresh docs and examples for renamed backup placeholders
</commit_message>
<xml_diff>
--- a/IED Backup Manager.docx
+++ b/IED Backup Manager.docx
@@ -380,7 +380,7 @@
         <w:pStyle w:val="BodyText"/>
       </w:pPr>
       <w:r>
-        <w:t xml:space="preserve">SE-CTU_20260612_1736.dz5</w:t>
+        <w:t xml:space="preserve">SE-BBB_20260612_1736.dz5</w:t>
       </w:r>
     </w:p>
     <w:p>
@@ -429,7 +429,7 @@
         <w:pStyle w:val="BodyText"/>
       </w:pPr>
       <w:r>
-        <w:t xml:space="preserve">SE-CTU_20260612_1736.dz5</w:t>
+        <w:t xml:space="preserve">SE-BBB_20260612_1736.dz5</w:t>
       </w:r>
     </w:p>
     <w:p>
@@ -461,7 +461,7 @@
         <w:pStyle w:val="BodyText"/>
       </w:pPr>
       <w:r>
-        <w:t xml:space="preserve">SE-CTU</w:t>
+        <w:t xml:space="preserve">SE-BBB</w:t>
       </w:r>
     </w:p>
     <w:p>
@@ -615,7 +615,7 @@
         <w:pStyle w:val="BodyText"/>
       </w:pPr>
       <w:r>
-        <w:t xml:space="preserve">SE-CTU_20260612_1736.dz5</w:t>
+        <w:t xml:space="preserve">SE-BBB_20260612_1736.dz5</w:t>
       </w:r>
     </w:p>
     <w:p>
@@ -712,7 +712,7 @@
         <w:pStyle w:val="BodyText"/>
       </w:pPr>
       <w:r>
-        <w:t xml:space="preserve">DIGSI-V100_SE-CTU_20260612-1739_JEAN-CARLOS-MACHADO_DEV.zip</w:t>
+        <w:t xml:space="preserve">DIGSI-V100_SE-BBB_20260612-1739_COLABORADOR-EXEMPLO_DEV.zip</w:t>
       </w:r>
     </w:p>
     <w:p>
@@ -949,7 +949,7 @@
         <w:t xml:space="preserve"> </w:t>
       </w:r>
       <w:r>
-        <w:t xml:space="preserve">“JEAN-CARLOS-MACHADO”</w:t>
+        <w:t xml:space="preserve">“COLABORADOR-EXEMPLO”</w:t>
       </w:r>
       <w:r>
         <w:t xml:space="preserve">,</w:t>
@@ -967,7 +967,7 @@
         <w:t xml:space="preserve"> </w:t>
       </w:r>
       <w:r>
-        <w:t xml:space="preserve">“C:/Users/Jean/OneDrive/BKP/ATU”</w:t>
+        <w:t xml:space="preserve">“C:/Backups/Exemplo/ATU”</w:t>
       </w:r>
       <w:r>
         <w:t xml:space="preserve">,</w:t>
@@ -985,7 +985,7 @@
         <w:t xml:space="preserve"> </w:t>
       </w:r>
       <w:r>
-        <w:t xml:space="preserve">“C:/Users/Jean/OneDrive/BKP/HIS”</w:t>
+        <w:t xml:space="preserve">“C:/Backups/Exemplo/HIS”</w:t>
       </w:r>
       <w:r>
         <w:t xml:space="preserve"> </w:t>
@@ -1621,7 +1621,7 @@
         <w:pStyle w:val="BodyText"/>
       </w:pPr>
       <w:r>
-        <w:t xml:space="preserve">DIGSI-V100_SE-CTU</w:t>
+        <w:t xml:space="preserve">DIGSI-V100_SE-BBB</w:t>
       </w:r>
     </w:p>
     <w:p>
@@ -1727,7 +1727,7 @@
         <w:pStyle w:val="BodyText"/>
       </w:pPr>
       <w:r>
-        <w:t xml:space="preserve">DIGSI-V100_SE-CTU</w:t>
+        <w:t xml:space="preserve">DIGSI-V100_SE-BBB</w:t>
       </w:r>
     </w:p>
     <w:p>
@@ -1760,7 +1760,7 @@
         <w:pStyle w:val="BodyText"/>
       </w:pPr>
       <w:r>
-        <w:t xml:space="preserve">DIGSI-V100_SE-CTU_20260612-1739_JEAN-CARLOS-MACHADO_DEV.zip</w:t>
+        <w:t xml:space="preserve">DIGSI-V100_SE-BBB_20260612-1739_COLABORADOR-EXEMPLO_DEV.zip</w:t>
       </w:r>
     </w:p>
     <w:p>
@@ -1776,7 +1776,7 @@
         <w:pStyle w:val="BodyText"/>
       </w:pPr>
       <w:r>
-        <w:t xml:space="preserve">DIGSI-V100_SE-CTU_20260615-0910_JEAN-CARLOS-MACHADO_DEV.zip</w:t>
+        <w:t xml:space="preserve">DIGSI-V100_SE-BBB_20260615-0910_COLABORADOR-EXEMPLO_DEV.zip</w:t>
       </w:r>
     </w:p>
     <w:p>
@@ -1833,7 +1833,7 @@
         <w:pStyle w:val="BodyText"/>
       </w:pPr>
       <w:r>
-        <w:t xml:space="preserve">DIGSI-V100_SE-JDI_20260612-1739_JEAN-CARLOS-MACHADO_DEV.zip</w:t>
+        <w:t xml:space="preserve">DIGSI-V100_SE-GGG_20260612-1739_COLABORADOR-EXEMPLO_DEV.zip</w:t>
       </w:r>
     </w:p>
     <w:p>
@@ -1849,7 +1849,7 @@
         <w:pStyle w:val="BodyText"/>
       </w:pPr>
       <w:r>
-        <w:t xml:space="preserve">DIGSI-V100_SE-CTU_20260615-0910_JEAN-CARLOS-MACHADO_DEV.zip</w:t>
+        <w:t xml:space="preserve">DIGSI-V100_SE-BBB_20260615-0910_COLABORADOR-EXEMPLO_DEV.zip</w:t>
       </w:r>
     </w:p>
     <w:p>
@@ -1906,7 +1906,7 @@
         <w:pStyle w:val="BodyText"/>
       </w:pPr>
       <w:r>
-        <w:t xml:space="preserve">DIGSI-V100_SE-CTU_20260615-0910_JEAN-CARLOS-MACHADO_DEV.zip</w:t>
+        <w:t xml:space="preserve">DIGSI-V100_SE-BBB_20260615-0910_COLABORADOR-EXEMPLO_DEV.zip</w:t>
       </w:r>
     </w:p>
     <w:p>
@@ -1922,7 +1922,7 @@
         <w:pStyle w:val="BodyText"/>
       </w:pPr>
       <w:r>
-        <w:t xml:space="preserve">DIGSI-V100_SE-CTU_20260612-1739_JEAN-CARLOS-MACHADO_DEV.zip</w:t>
+        <w:t xml:space="preserve">DIGSI-V100_SE-BBB_20260612-1739_COLABORADOR-EXEMPLO_DEV.zip</w:t>
       </w:r>
     </w:p>
     <w:p>

</xml_diff>